<commit_message>
Se Modifico el archivo y se agrego hola mundo
</commit_message>
<xml_diff>
--- a/Ejemplo.docx
+++ b/Ejemplo.docx
@@ -13,6 +13,20 @@
           <w:lang w:val="es-ES"/>
         </w:rPr>
         <w:t>Ejemplo:</w:t>
+      </w:r>
+    </w:p>
+    <w:p>
+      <w:pPr>
+        <w:rPr>
+          <w:u w:val="single"/>
+          <w:lang w:val="es-ES"/>
+        </w:rPr>
+      </w:pPr>
+      <w:r>
+        <w:rPr>
+          <w:lang w:val="es-ES"/>
+        </w:rPr>
+        <w:t>Hola Mundo</w:t>
       </w:r>
     </w:p>
     <w:sectPr>

</xml_diff>

<commit_message>
Se actualizo y se agrego jgonzalez
</commit_message>
<xml_diff>
--- a/Ejemplo.docx
+++ b/Ejemplo.docx
@@ -21,12 +21,14 @@
           <w:lang w:val="es-ES"/>
         </w:rPr>
       </w:pPr>
+      <w:proofErr w:type="spellStart"/>
       <w:r>
         <w:rPr>
           <w:lang w:val="es-ES"/>
         </w:rPr>
-        <w:t>Hola Mundo</w:t>
+        <w:t>jgonzalez</w:t>
       </w:r>
+      <w:proofErr w:type="spellEnd"/>
     </w:p>
     <w:sectPr>
       <w:pgSz w:w="12240" w:h="15840"/>

</xml_diff>